<commit_message>
Completa a sintese da Questao 2 com o texto integral do artigo
Com o PDF do Artigo 02 em maos, a sintese foi reescrita a partir do
texto completo, e nao mais do resumo: autoria (Cardoso, Moreira e
Parente/IFTO) e DOI na referencia, dados do IESGO 2024, EFGD 2024-2027
(Decreto 12.198/2024), detalhamento do DSR (12 gestores entrevistados,
grupo focal com 8 especialistas, analise de conteudo de Bardin), as
seis dimensoes do modelo, os dominios de governanca e gestao no padrao
COBIT, a linha do tempo 2018-2024, a evolucao dos indices iGovTI
(28% -> 75,5%) e iGestTI (34% -> 88,5%), a execucao do PDTIC e as
limitacoes declaradas pelos autores.

O texto foi ajustado para caber no limite de 2 paginas do enunciado.
Removida a nota de pendencias, que nao se aplica mais.

Co-Authored-By: Claude Opus 5 <noreply@anthropic.com>
Claude-Session: https://claude.ai/code/session_012D1pVKgmbDU3q74nzc1kDE
</commit_message>
<xml_diff>
--- a/Lista02-Governanca-TI/Lista02-Governanca-TI.docx
+++ b/Lista02-Governanca-TI/Lista02-Governanca-TI.docx
@@ -3264,14 +3264,10 @@
       </w:r>
     </w:p>
     <w:p>
-      <w:r>
-        <w:br w:type="page"/>
-      </w:r>
-    </w:p>
-    <w:p>
       <w:pPr>
         <w:pStyle w:val="Heading1"/>
-        <w:spacing w:after="200" w:before="280"/>
+        <w:pageBreakBefore/>
+        <w:spacing w:after="200" w:before="0"/>
       </w:pPr>
       <w:r>
         <w:rPr>
@@ -3300,7 +3296,7 @@
           <w:sz w:val="20"/>
           <w:szCs w:val="20"/>
         </w:rPr>
-        <w:t xml:space="preserve">Referência: Governança digital: uma estratégia para o sucesso da transformação digital na educação pública federal. Revista Sítio Novo, Palmas, v. 9, e1795, 2025. e-ISSN: 2594-7036. 20 p. Disponível em: https://sitionovo.ifto.edu.br/index.php/sitionovo/article/view/1795</w:t>
+        <w:t xml:space="preserve">CARDOSO, Fabiana Ferreira; MOREIRA, Kleyton Matos; PARENTE, Ronaldo Vasconcelos. Governança digital: uma estratégia para o sucesso da transformação digital na educação pública federal. Rev. Sítio Novo, Palmas, v. 9, e1795, 2025. DOI: 10.47236/2594-7036.2025.v9.1795.</w:t>
       </w:r>
     </w:p>
     <w:p>
@@ -3316,48 +3312,25 @@
           <w:sz w:val="26"/>
           <w:szCs w:val="26"/>
         </w:rPr>
-        <w:t xml:space="preserve">1. Contexto e problema</w:t>
-      </w:r>
-    </w:p>
-    <w:p>
-      <w:pPr>
-        <w:spacing w:after="140" w:line="276"/>
-      </w:pPr>
-      <w:r>
-        <w:t xml:space="preserve">O artigo parte de um diagnóstico conhecido do setor público brasileiro: a </w:t>
-      </w:r>
-      <w:r>
-        <w:rPr>
-          <w:b/>
-          <w:bCs/>
-        </w:rPr>
-        <w:t xml:space="preserve">baixa maturidade em governança de Tecnologia da Informação</w:t>
-      </w:r>
-      <w:r>
-        <w:t xml:space="preserve"> nas organizações públicas. Esse problema, segundo os autores, é </w:t>
-      </w:r>
-      <w:r>
-        <w:rPr>
-          <w:b/>
-          <w:bCs/>
-        </w:rPr>
-        <w:t xml:space="preserve">agravado nas Instituições Federais de Ensino (IFEs)</w:t>
-      </w:r>
-      <w:r>
-        <w:t xml:space="preserve"> por um conjunto de condições próprias dessas instituições:</w:t>
-      </w:r>
-    </w:p>
-    <w:p>
-      <w:pPr>
-        <w:pStyle w:val="ListParagraph"/>
-        <w:numPr>
-          <w:ilvl w:val="0"/>
-          <w:numId w:val="2"/>
-        </w:numPr>
-        <w:spacing w:after="90" w:line="276"/>
-      </w:pPr>
-      <w:r>
-        <w:t xml:space="preserve">a </w:t>
+        <w:t xml:space="preserve">1. Problema e contexto</w:t>
+      </w:r>
+    </w:p>
+    <w:p>
+      <w:pPr>
+        <w:spacing w:after="140" w:line="276"/>
+      </w:pPr>
+      <w:r>
+        <w:t xml:space="preserve">O artigo trata da </w:t>
+      </w:r>
+      <w:r>
+        <w:rPr>
+          <w:b/>
+          <w:bCs/>
+        </w:rPr>
+        <w:t xml:space="preserve">maturidade em governança digital (GD) como fator crítico da transformação digital nas Instituições Federais de Ensino (IFEs)</w:t>
+      </w:r>
+      <w:r>
+        <w:t xml:space="preserve">. O problema é a baixa maturidade da governança de TI no setor público, agravada nas IFEs pela </w:t>
       </w:r>
       <w:r>
         <w:rPr>
@@ -3367,20 +3340,7 @@
         <w:t xml:space="preserve">descentralização multicampi</w:t>
       </w:r>
       <w:r>
-        <w:t xml:space="preserve">, que espalha decisões, equipes e infraestrutura por unidades geograficamente distantes e com realidades diferentes;</w:t>
-      </w:r>
-    </w:p>
-    <w:p>
-      <w:pPr>
-        <w:pStyle w:val="ListParagraph"/>
-        <w:numPr>
-          <w:ilvl w:val="0"/>
-          <w:numId w:val="2"/>
-        </w:numPr>
-        <w:spacing w:after="90" w:line="276"/>
-      </w:pPr>
-      <w:r>
-        <w:t xml:space="preserve">as </w:t>
+        <w:t xml:space="preserve">, pelas </w:t>
       </w:r>
       <w:r>
         <w:rPr>
@@ -3390,48 +3350,93 @@
         <w:t xml:space="preserve">restrições orçamentárias</w:t>
       </w:r>
       <w:r>
-        <w:t xml:space="preserve"> típicas da administração pública federal;</w:t>
-      </w:r>
-    </w:p>
-    <w:p>
-      <w:pPr>
-        <w:pStyle w:val="ListParagraph"/>
-        <w:numPr>
-          <w:ilvl w:val="0"/>
-          <w:numId w:val="2"/>
-        </w:numPr>
-        <w:spacing w:after="90" w:line="276"/>
-      </w:pPr>
-      <w:r>
-        <w:t xml:space="preserve">a </w:t>
-      </w:r>
-      <w:r>
-        <w:rPr>
-          <w:b/>
-          <w:bCs/>
-        </w:rPr>
-        <w:t xml:space="preserve">escassez de profissionais</w:t>
-      </w:r>
-      <w:r>
-        <w:t xml:space="preserve"> especializados em TI, tanto em quantidade quanto em qualificação.</w:t>
-      </w:r>
-    </w:p>
-    <w:p>
-      <w:pPr>
-        <w:spacing w:after="140" w:line="276"/>
-      </w:pPr>
-      <w:r>
-        <w:t xml:space="preserve">Esse cenário cria uma tensão direta com o que o Estado brasileiro vem exigindo dessas mesmas instituições: a </w:t>
-      </w:r>
-      <w:r>
-        <w:rPr>
-          <w:b/>
-          <w:bCs/>
-        </w:rPr>
-        <w:t xml:space="preserve">Estratégia Federal de Governo Digital (EFGD)</w:t>
-      </w:r>
-      <w:r>
-        <w:t xml:space="preserve"> estabelece diretrizes de transformação digital que pressupõem justamente aquilo que falta — estrutura de governança, políticas institucionalizadas, processos formalizados e capacidade de execução.</w:t>
+        <w:t xml:space="preserve"> e pela </w:t>
+      </w:r>
+      <w:r>
+        <w:rPr>
+          <w:b/>
+          <w:bCs/>
+        </w:rPr>
+        <w:t xml:space="preserve">escassez de profissionais qualificados</w:t>
+      </w:r>
+      <w:r>
+        <w:t xml:space="preserve">.</w:t>
+      </w:r>
+    </w:p>
+    <w:p>
+      <w:pPr>
+        <w:spacing w:after="140" w:line="276"/>
+      </w:pPr>
+      <w:r>
+        <w:t xml:space="preserve">O diagnóstico não é uma impressão dos autores: o </w:t>
+      </w:r>
+      <w:r>
+        <w:rPr>
+          <w:b/>
+          <w:bCs/>
+        </w:rPr>
+        <w:t xml:space="preserve">IESGO 2024</w:t>
+      </w:r>
+      <w:r>
+        <w:t xml:space="preserve">, do TCU, mostrou que, das </w:t>
+      </w:r>
+      <w:r>
+        <w:rPr>
+          <w:b/>
+          <w:bCs/>
+        </w:rPr>
+        <w:t xml:space="preserve">387 organizações avaliadas, quase metade está em estágio inicial de maturidade</w:t>
+      </w:r>
+      <w:r>
+        <w:t xml:space="preserve"> nas práticas de governança de TI. Do outro lado da equação está a exigência normativa — o Sistema Nacional para a Transformação Digital (2018) e, sobretudo, a </w:t>
+      </w:r>
+      <w:r>
+        <w:rPr>
+          <w:b/>
+          <w:bCs/>
+        </w:rPr>
+        <w:t xml:space="preserve">Estratégia Federal de Governo Digital (EFGD) 2024–2027</w:t>
+      </w:r>
+      <w:r>
+        <w:t xml:space="preserve">, instituída pelo Decreto nº 12.198/2024, com </w:t>
+      </w:r>
+      <w:r>
+        <w:rPr>
+          <w:b/>
+          <w:bCs/>
+        </w:rPr>
+        <w:t xml:space="preserve">6 princípios, 16 objetivos e 93 iniciativas</w:t>
+      </w:r>
+      <w:r>
+        <w:t xml:space="preserve">. Há, portanto, uma distância entre o que se cobra das IFEs e a maturidade que elas têm.</w:t>
+      </w:r>
+    </w:p>
+    <w:p>
+      <w:pPr>
+        <w:spacing w:after="140" w:line="276"/>
+      </w:pPr>
+      <w:r>
+        <w:t xml:space="preserve">Os autores identificam ainda uma </w:t>
+      </w:r>
+      <w:r>
+        <w:rPr>
+          <w:b/>
+          <w:bCs/>
+        </w:rPr>
+        <w:t xml:space="preserve">lacuna de pesquisa</w:t>
+      </w:r>
+      <w:r>
+        <w:t xml:space="preserve">: embora existam frameworks consolidados (COBIT 2019, ITIL 4, ABNT NBR ISO/IEC 38500), faltam estudos que os </w:t>
+      </w:r>
+      <w:r>
+        <w:rPr>
+          <w:b/>
+          <w:bCs/>
+        </w:rPr>
+        <w:t xml:space="preserve">adaptem às especificidades das IFEs</w:t>
+      </w:r>
+      <w:r>
+        <w:t xml:space="preserve">. Aplicá-los isoladamente gera sobreposições: os três tratam de segurança da informação e gestão de riscos, criando redundâncias caras para instituições com poucos recursos.</w:t>
       </w:r>
     </w:p>
     <w:p>
@@ -3447,35 +3452,25 @@
           <w:sz w:val="26"/>
           <w:szCs w:val="26"/>
         </w:rPr>
-        <w:t xml:space="preserve">2. Justificativa</w:t>
-      </w:r>
-    </w:p>
-    <w:p>
-      <w:pPr>
-        <w:spacing w:after="140" w:line="276"/>
-      </w:pPr>
-      <w:r>
-        <w:t xml:space="preserve">A pesquisa se justifica pela </w:t>
-      </w:r>
-      <w:r>
-        <w:rPr>
-          <w:b/>
-          <w:bCs/>
-        </w:rPr>
-        <w:t xml:space="preserve">necessidade de adaptar frameworks consolidados de governança às especificidades das IFEs</w:t>
-      </w:r>
-      <w:r>
-        <w:t xml:space="preserve">. Os modelos de referência amplamente usados no mercado (e mesmo os referenciais do setor público) não foram concebidos considerando a realidade multicampi, o regime orçamentário e as limitações de pessoal de uma instituição federal de ensino. Aplicá-los “como estão” tende a produzir documentos de gaveta em vez de governança efetiva. Daí a proposta de construir e avaliar uma solução </w:t>
-      </w:r>
-      <w:r>
-        <w:rPr>
-          <w:b/>
-          <w:bCs/>
-        </w:rPr>
-        <w:t xml:space="preserve">ajustada a esse contexto e alinhada às diretrizes da EFGD</w:t>
-      </w:r>
-      <w:r>
-        <w:t xml:space="preserve">.</w:t>
+        <w:t xml:space="preserve">2. Objetivo</w:t>
+      </w:r>
+    </w:p>
+    <w:p>
+      <w:pPr>
+        <w:spacing w:after="140" w:line="276"/>
+      </w:pPr>
+      <w:r>
+        <w:t xml:space="preserve">Analisar criticamente a </w:t>
+      </w:r>
+      <w:r>
+        <w:rPr>
+          <w:b/>
+          <w:bCs/>
+        </w:rPr>
+        <w:t xml:space="preserve">implementação de um modelo de governança digital adaptado ao setor educacional público federal</w:t>
+      </w:r>
+      <w:r>
+        <w:t xml:space="preserve"> e sua contribuição para elevar a maturidade das IFEs. A pergunta de pesquisa: como as IFEs brasileiras podem elevar seu nível de maturidade em governança digital?</w:t>
       </w:r>
     </w:p>
     <w:p>
@@ -3491,25 +3486,123 @@
           <w:sz w:val="26"/>
           <w:szCs w:val="26"/>
         </w:rPr>
-        <w:t xml:space="preserve">3. Objetivo</w:t>
-      </w:r>
-    </w:p>
-    <w:p>
-      <w:pPr>
-        <w:spacing w:after="140" w:line="276"/>
-      </w:pPr>
-      <w:r>
-        <w:t xml:space="preserve">O objetivo geral é </w:t>
-      </w:r>
-      <w:r>
-        <w:rPr>
-          <w:b/>
-          <w:bCs/>
-        </w:rPr>
-        <w:t xml:space="preserve">analisar criticamente a implantação de um modelo de governança digital no setor da educação pública federal</w:t>
-      </w:r>
-      <w:r>
-        <w:t xml:space="preserve"> — isto é, não apenas propor o modelo, mas acompanhar e avaliar o que acontece quando ele é efetivamente implantado em uma instituição real ao longo do tempo.</w:t>
+        <w:t xml:space="preserve">3. Metodologia</w:t>
+      </w:r>
+    </w:p>
+    <w:p>
+      <w:pPr>
+        <w:spacing w:after="140" w:line="276"/>
+      </w:pPr>
+      <w:r>
+        <w:t xml:space="preserve">Pesquisa </w:t>
+      </w:r>
+      <w:r>
+        <w:rPr>
+          <w:b/>
+          <w:bCs/>
+        </w:rPr>
+        <w:t xml:space="preserve">aplicada, qualitativa</w:t>
+      </w:r>
+      <w:r>
+        <w:t xml:space="preserve">, conduzida pelo método </w:t>
+      </w:r>
+      <w:r>
+        <w:rPr>
+          <w:b/>
+          <w:bCs/>
+        </w:rPr>
+        <w:t xml:space="preserve">Design Science Research (DSR)</w:t>
+      </w:r>
+      <w:r>
+        <w:t xml:space="preserve"> de Peffers (2007), por meio de um </w:t>
+      </w:r>
+      <w:r>
+        <w:rPr>
+          <w:b/>
+          <w:bCs/>
+        </w:rPr>
+        <w:t xml:space="preserve">estudo de caso longitudinal (2018–2024)</w:t>
+      </w:r>
+      <w:r>
+        <w:t xml:space="preserve"> em uma IFE multicampi da </w:t>
+      </w:r>
+      <w:r>
+        <w:rPr>
+          <w:b/>
+          <w:bCs/>
+        </w:rPr>
+        <w:t xml:space="preserve">região Norte</w:t>
+      </w:r>
+      <w:r>
+        <w:t xml:space="preserve">, escolhida por conveniência. O DSR percorreu suas seis etapas: identificação do problema, objetivos da solução, design e desenvolvimento, demonstração, avaliação e comunicação.</w:t>
+      </w:r>
+    </w:p>
+    <w:p>
+      <w:pPr>
+        <w:spacing w:after="140" w:line="276"/>
+      </w:pPr>
+      <w:r>
+        <w:t xml:space="preserve">A coleta usou </w:t>
+      </w:r>
+      <w:r>
+        <w:rPr>
+          <w:b/>
+          <w:bCs/>
+        </w:rPr>
+        <w:t xml:space="preserve">triangulação metodológica</w:t>
+      </w:r>
+      <w:r>
+        <w:t xml:space="preserve">: análise documental (normativos, relatórios de auditoria, planos estratégicos), </w:t>
+      </w:r>
+      <w:r>
+        <w:rPr>
+          <w:b/>
+          <w:bCs/>
+        </w:rPr>
+        <w:t xml:space="preserve">entrevistas semiestruturadas com 12 gestores de TI</w:t>
+      </w:r>
+      <w:r>
+        <w:t xml:space="preserve"> e </w:t>
+      </w:r>
+      <w:r>
+        <w:rPr>
+          <w:b/>
+          <w:bCs/>
+        </w:rPr>
+        <w:t xml:space="preserve">grupo focal com 8 especialistas</w:t>
+      </w:r>
+      <w:r>
+        <w:t xml:space="preserve"> em governança digital — todos com no mínimo cinco anos de experiência. Os dados passaram por </w:t>
+      </w:r>
+      <w:r>
+        <w:rPr>
+          <w:b/>
+          <w:bCs/>
+        </w:rPr>
+        <w:t xml:space="preserve">análise de conteúdo temática</w:t>
+      </w:r>
+      <w:r>
+        <w:t xml:space="preserve"> (Bardin, 2016) e foram complementados por </w:t>
+      </w:r>
+      <w:r>
+        <w:rPr>
+          <w:b/>
+          <w:bCs/>
+        </w:rPr>
+        <w:t xml:space="preserve">indicadores quantitativos do TCU — o iGovTI e o iGestTI</w:t>
+      </w:r>
+      <w:r>
+        <w:t xml:space="preserve"> —, medidos em três ciclos: </w:t>
+      </w:r>
+      <w:r>
+        <w:rPr>
+          <w:b/>
+          <w:bCs/>
+        </w:rPr>
+        <w:t xml:space="preserve">2018, 2021 e 2024</w:t>
+      </w:r>
+      <w:r>
+        <w:t xml:space="preserve">.</w:t>
       </w:r>
     </w:p>
     <w:p>
@@ -3525,7 +3618,213 @@
           <w:sz w:val="26"/>
           <w:szCs w:val="26"/>
         </w:rPr>
-        <w:t xml:space="preserve">4. Metodologia</w:t>
+        <w:t xml:space="preserve">4. O modelo proposto</w:t>
+      </w:r>
+    </w:p>
+    <w:p>
+      <w:pPr>
+        <w:spacing w:after="140" w:line="276"/>
+      </w:pPr>
+      <w:r>
+        <w:t xml:space="preserve">O diagnóstico inicial apontou três eixos de atuação: </w:t>
+      </w:r>
+      <w:r>
+        <w:rPr>
+          <w:b/>
+          <w:bCs/>
+        </w:rPr>
+        <w:t xml:space="preserve">estrutura organizacional</w:t>
+      </w:r>
+      <w:r>
+        <w:t xml:space="preserve">, </w:t>
+      </w:r>
+      <w:r>
+        <w:rPr>
+          <w:b/>
+          <w:bCs/>
+        </w:rPr>
+        <w:t xml:space="preserve">padronização de políticas, normas e processos</w:t>
+      </w:r>
+      <w:r>
+        <w:t xml:space="preserve"> e </w:t>
+      </w:r>
+      <w:r>
+        <w:rPr>
+          <w:b/>
+          <w:bCs/>
+        </w:rPr>
+        <w:t xml:space="preserve">capacitação técnica contínua</w:t>
+      </w:r>
+      <w:r>
+        <w:t xml:space="preserve">.</w:t>
+      </w:r>
+    </w:p>
+    <w:p>
+      <w:pPr>
+        <w:spacing w:after="140" w:line="276"/>
+      </w:pPr>
+      <w:r>
+        <w:t xml:space="preserve">Sobre a articulação dos frameworks (Santos e Moura, 2024): </w:t>
+      </w:r>
+      <w:r>
+        <w:rPr>
+          <w:b/>
+          <w:bCs/>
+        </w:rPr>
+        <w:t xml:space="preserve">o COBIT define “o que” governar, o ITIL 4 descreve “como” operacionalizar os serviços e a ISO/IEC 38500 estabelece “por que” governar.</w:t>
+      </w:r>
+      <w:r>
+        <w:t xml:space="preserve"> O modelo é estruturado em </w:t>
+      </w:r>
+      <w:r>
+        <w:rPr>
+          <w:b/>
+          <w:bCs/>
+        </w:rPr>
+        <w:t xml:space="preserve">seis dimensões estratégicas</w:t>
+      </w:r>
+      <w:r>
+        <w:t xml:space="preserve"> — responsabilidade, estratégia, aquisição, desempenho, conformidade e comportamento humano — e apoiado nos eixos de pessoas, processos, organização, comunicação, legislação e tecnologia.</w:t>
+      </w:r>
+    </w:p>
+    <w:p>
+      <w:pPr>
+        <w:spacing w:after="140" w:line="276"/>
+      </w:pPr>
+      <w:r>
+        <w:t xml:space="preserve">No padrão do COBIT, separa dois domínios: </w:t>
+      </w:r>
+      <w:r>
+        <w:rPr>
+          <w:b/>
+          <w:bCs/>
+        </w:rPr>
+        <w:t xml:space="preserve">governança</w:t>
+      </w:r>
+      <w:r>
+        <w:t xml:space="preserve"> (avaliar, dirigir e monitorar, a cargo do corpo diretivo) e </w:t>
+      </w:r>
+      <w:r>
+        <w:rPr>
+          <w:b/>
+          <w:bCs/>
+        </w:rPr>
+        <w:t xml:space="preserve">gestão</w:t>
+      </w:r>
+      <w:r>
+        <w:t xml:space="preserve"> (alinhar, planejar e organizar; construir, adquirir e implementar; entregar, serviço e suporte; monitorar, avaliar e analisar), tudo dentro de um </w:t>
+      </w:r>
+      <w:r>
+        <w:rPr>
+          <w:b/>
+          <w:bCs/>
+        </w:rPr>
+        <w:t xml:space="preserve">ciclo PDCA</w:t>
+      </w:r>
+      <w:r>
+        <w:t xml:space="preserve">.</w:t>
+      </w:r>
+    </w:p>
+    <w:p>
+      <w:pPr>
+        <w:pStyle w:val="Heading2"/>
+        <w:spacing w:after="160" w:before="300"/>
+      </w:pPr>
+      <w:r>
+        <w:rPr>
+          <w:b/>
+          <w:bCs/>
+          <w:color w:val="1F3864"/>
+          <w:sz w:val="26"/>
+          <w:szCs w:val="26"/>
+        </w:rPr>
+        <w:t xml:space="preserve">5. Resultados</w:t>
+      </w:r>
+    </w:p>
+    <w:p>
+      <w:pPr>
+        <w:spacing w:after="140" w:line="276"/>
+      </w:pPr>
+      <w:r>
+        <w:t xml:space="preserve">A implantação foi progressiva: em </w:t>
+      </w:r>
+      <w:r>
+        <w:rPr>
+          <w:b/>
+          <w:bCs/>
+        </w:rPr>
+        <w:t xml:space="preserve">2018</w:t>
+      </w:r>
+      <w:r>
+        <w:t xml:space="preserve"> a Diretoria de TI tornou-se setor sistêmico no gabinete do reitor; em </w:t>
+      </w:r>
+      <w:r>
+        <w:rPr>
+          <w:b/>
+          <w:bCs/>
+        </w:rPr>
+        <w:t xml:space="preserve">2019</w:t>
+      </w:r>
+      <w:r>
+        <w:t xml:space="preserve"> vieram a Coordenação de Governança de TI e o </w:t>
+      </w:r>
+      <w:r>
+        <w:rPr>
+          <w:b/>
+          <w:bCs/>
+        </w:rPr>
+        <w:t xml:space="preserve">Comitê Gestor de TI (CGTI)</w:t>
+      </w:r>
+      <w:r>
+        <w:t xml:space="preserve">; em </w:t>
+      </w:r>
+      <w:r>
+        <w:rPr>
+          <w:b/>
+          <w:bCs/>
+        </w:rPr>
+        <w:t xml:space="preserve">2020</w:t>
+      </w:r>
+      <w:r>
+        <w:t xml:space="preserve">, o PDTIC 2020–2024; em </w:t>
+      </w:r>
+      <w:r>
+        <w:rPr>
+          <w:b/>
+          <w:bCs/>
+        </w:rPr>
+        <w:t xml:space="preserve">2021</w:t>
+      </w:r>
+      <w:r>
+        <w:t xml:space="preserve">, a política e o modelo de GD, os frameworks e a capacitação via RNP e ENAP; em </w:t>
+      </w:r>
+      <w:r>
+        <w:rPr>
+          <w:b/>
+          <w:bCs/>
+        </w:rPr>
+        <w:t xml:space="preserve">2023</w:t>
+      </w:r>
+      <w:r>
+        <w:t xml:space="preserve">, o Programa de Privacidade e Segurança da Informação; e em </w:t>
+      </w:r>
+      <w:r>
+        <w:rPr>
+          <w:b/>
+          <w:bCs/>
+        </w:rPr>
+        <w:t xml:space="preserve">2024</w:t>
+      </w:r>
+      <w:r>
+        <w:t xml:space="preserve">, a integração dos planos e a adesão à nova EFGD.</w:t>
+      </w:r>
+    </w:p>
+    <w:p>
+      <w:pPr>
+        <w:spacing w:after="140" w:line="276"/>
+      </w:pPr>
+      <w:r>
+        <w:t xml:space="preserve">Os índices do TCU comprovam a evolução:</w:t>
       </w:r>
     </w:p>
     <w:tbl>
@@ -3541,8 +3840,10 @@
         </w:tblBorders>
       </w:tblPr>
       <w:tblGrid>
-        <w:gridCol w:w="2700"/>
-        <w:gridCol w:w="6900"/>
+        <w:gridCol w:w="3000"/>
+        <w:gridCol w:w="2200"/>
+        <w:gridCol w:w="2200"/>
+        <w:gridCol w:w="2200"/>
       </w:tblGrid>
       <w:tr>
         <w:trPr>
@@ -3550,7 +3851,7 @@
         </w:trPr>
         <w:tc>
           <w:tcPr>
-            <w:tcW w:type="dxa" w:w="2700"/>
+            <w:tcW w:type="dxa" w:w="3000"/>
             <w:shd w:fill="1F3864" w:color="auto" w:val="clear"/>
             <w:tcMar>
               <w:top w:type="dxa" w:w="90"/>
@@ -3571,13 +3872,13 @@
                 <w:sz w:val="20"/>
                 <w:szCs w:val="20"/>
               </w:rPr>
-              <w:t xml:space="preserve">Elemento</w:t>
-            </w:r>
-          </w:p>
-        </w:tc>
-        <w:tc>
-          <w:tcPr>
-            <w:tcW w:type="dxa" w:w="6900"/>
+              <w:t xml:space="preserve">Índice</w:t>
+            </w:r>
+          </w:p>
+        </w:tc>
+        <w:tc>
+          <w:tcPr>
+            <w:tcW w:type="dxa" w:w="2200"/>
             <w:shd w:fill="1F3864" w:color="auto" w:val="clear"/>
             <w:tcMar>
               <w:top w:type="dxa" w:w="90"/>
@@ -3598,7 +3899,61 @@
                 <w:sz w:val="20"/>
                 <w:szCs w:val="20"/>
               </w:rPr>
-              <w:t xml:space="preserve">Definição adotada no artigo</w:t>
+              <w:t xml:space="preserve">2018</w:t>
+            </w:r>
+          </w:p>
+        </w:tc>
+        <w:tc>
+          <w:tcPr>
+            <w:tcW w:type="dxa" w:w="2200"/>
+            <w:shd w:fill="1F3864" w:color="auto" w:val="clear"/>
+            <w:tcMar>
+              <w:top w:type="dxa" w:w="90"/>
+              <w:left w:type="dxa" w:w="120"/>
+              <w:bottom w:type="dxa" w:w="90"/>
+              <w:right w:type="dxa" w:w="120"/>
+            </w:tcMar>
+          </w:tcPr>
+          <w:p>
+            <w:pPr>
+              <w:spacing w:after="0" w:line="252"/>
+            </w:pPr>
+            <w:r>
+              <w:rPr>
+                <w:b/>
+                <w:bCs/>
+                <w:color w:val="FFFFFF"/>
+                <w:sz w:val="20"/>
+                <w:szCs w:val="20"/>
+              </w:rPr>
+              <w:t xml:space="preserve">2021</w:t>
+            </w:r>
+          </w:p>
+        </w:tc>
+        <w:tc>
+          <w:tcPr>
+            <w:tcW w:type="dxa" w:w="2200"/>
+            <w:shd w:fill="1F3864" w:color="auto" w:val="clear"/>
+            <w:tcMar>
+              <w:top w:type="dxa" w:w="90"/>
+              <w:left w:type="dxa" w:w="120"/>
+              <w:bottom w:type="dxa" w:w="90"/>
+              <w:right w:type="dxa" w:w="120"/>
+            </w:tcMar>
+          </w:tcPr>
+          <w:p>
+            <w:pPr>
+              <w:spacing w:after="0" w:line="252"/>
+            </w:pPr>
+            <w:r>
+              <w:rPr>
+                <w:b/>
+                <w:bCs/>
+                <w:color w:val="FFFFFF"/>
+                <w:sz w:val="20"/>
+                <w:szCs w:val="20"/>
+              </w:rPr>
+              <w:t xml:space="preserve">2024</w:t>
             </w:r>
           </w:p>
         </w:tc>
@@ -3609,47 +3964,93 @@
         </w:trPr>
         <w:tc>
           <w:tcPr>
-            <w:tcW w:type="dxa" w:w="2700"/>
-            <w:tcMar>
-              <w:top w:type="dxa" w:w="90"/>
-              <w:left w:type="dxa" w:w="120"/>
-              <w:bottom w:type="dxa" w:w="90"/>
-              <w:right w:type="dxa" w:w="120"/>
-            </w:tcMar>
-          </w:tcPr>
-          <w:p>
-            <w:pPr>
-              <w:spacing w:after="0" w:line="252"/>
-            </w:pPr>
-            <w:r>
-              <w:rPr>
-                <w:sz w:val="20"/>
-                <w:szCs w:val="20"/>
-              </w:rPr>
-              <w:t xml:space="preserve">Método</w:t>
-            </w:r>
-          </w:p>
-        </w:tc>
-        <w:tc>
-          <w:tcPr>
-            <w:tcW w:type="dxa" w:w="6900"/>
-            <w:tcMar>
-              <w:top w:type="dxa" w:w="90"/>
-              <w:left w:type="dxa" w:w="120"/>
-              <w:bottom w:type="dxa" w:w="90"/>
-              <w:right w:type="dxa" w:w="120"/>
-            </w:tcMar>
-          </w:tcPr>
-          <w:p>
-            <w:pPr>
-              <w:spacing w:after="0" w:line="252"/>
-            </w:pPr>
-            <w:r>
-              <w:rPr>
-                <w:sz w:val="20"/>
-                <w:szCs w:val="20"/>
-              </w:rPr>
-              <w:t xml:space="preserve">Design Science Research (DSR)</w:t>
+            <w:tcW w:type="dxa" w:w="3000"/>
+            <w:tcMar>
+              <w:top w:type="dxa" w:w="90"/>
+              <w:left w:type="dxa" w:w="120"/>
+              <w:bottom w:type="dxa" w:w="90"/>
+              <w:right w:type="dxa" w:w="120"/>
+            </w:tcMar>
+          </w:tcPr>
+          <w:p>
+            <w:pPr>
+              <w:spacing w:after="0" w:line="252"/>
+            </w:pPr>
+            <w:r>
+              <w:rPr>
+                <w:sz w:val="20"/>
+                <w:szCs w:val="20"/>
+              </w:rPr>
+              <w:t xml:space="preserve">iGovTI</w:t>
+            </w:r>
+          </w:p>
+        </w:tc>
+        <w:tc>
+          <w:tcPr>
+            <w:tcW w:type="dxa" w:w="2200"/>
+            <w:tcMar>
+              <w:top w:type="dxa" w:w="90"/>
+              <w:left w:type="dxa" w:w="120"/>
+              <w:bottom w:type="dxa" w:w="90"/>
+              <w:right w:type="dxa" w:w="120"/>
+            </w:tcMar>
+          </w:tcPr>
+          <w:p>
+            <w:pPr>
+              <w:spacing w:after="0" w:line="252"/>
+            </w:pPr>
+            <w:r>
+              <w:rPr>
+                <w:sz w:val="20"/>
+                <w:szCs w:val="20"/>
+              </w:rPr>
+              <w:t xml:space="preserve">28%</w:t>
+            </w:r>
+          </w:p>
+        </w:tc>
+        <w:tc>
+          <w:tcPr>
+            <w:tcW w:type="dxa" w:w="2200"/>
+            <w:tcMar>
+              <w:top w:type="dxa" w:w="90"/>
+              <w:left w:type="dxa" w:w="120"/>
+              <w:bottom w:type="dxa" w:w="90"/>
+              <w:right w:type="dxa" w:w="120"/>
+            </w:tcMar>
+          </w:tcPr>
+          <w:p>
+            <w:pPr>
+              <w:spacing w:after="0" w:line="252"/>
+            </w:pPr>
+            <w:r>
+              <w:rPr>
+                <w:sz w:val="20"/>
+                <w:szCs w:val="20"/>
+              </w:rPr>
+              <w:t xml:space="preserve">53,4%</w:t>
+            </w:r>
+          </w:p>
+        </w:tc>
+        <w:tc>
+          <w:tcPr>
+            <w:tcW w:type="dxa" w:w="2200"/>
+            <w:tcMar>
+              <w:top w:type="dxa" w:w="90"/>
+              <w:left w:type="dxa" w:w="120"/>
+              <w:bottom w:type="dxa" w:w="90"/>
+              <w:right w:type="dxa" w:w="120"/>
+            </w:tcMar>
+          </w:tcPr>
+          <w:p>
+            <w:pPr>
+              <w:spacing w:after="0" w:line="252"/>
+            </w:pPr>
+            <w:r>
+              <w:rPr>
+                <w:sz w:val="20"/>
+                <w:szCs w:val="20"/>
+              </w:rPr>
+              <w:t xml:space="preserve">75,5%</w:t>
             </w:r>
           </w:p>
         </w:tc>
@@ -3660,7 +4061,7 @@
         </w:trPr>
         <w:tc>
           <w:tcPr>
-            <w:tcW w:type="dxa" w:w="2700"/>
+            <w:tcW w:type="dxa" w:w="3000"/>
             <w:shd w:fill="F2F2F2" w:color="auto" w:val="clear"/>
             <w:tcMar>
               <w:top w:type="dxa" w:w="90"/>
@@ -3678,13 +4079,13 @@
                 <w:sz w:val="20"/>
                 <w:szCs w:val="20"/>
               </w:rPr>
-              <w:t xml:space="preserve">Abordagem</w:t>
-            </w:r>
-          </w:p>
-        </w:tc>
-        <w:tc>
-          <w:tcPr>
-            <w:tcW w:type="dxa" w:w="6900"/>
+              <w:t xml:space="preserve">iGestTI</w:t>
+            </w:r>
+          </w:p>
+        </w:tc>
+        <w:tc>
+          <w:tcPr>
+            <w:tcW w:type="dxa" w:w="2200"/>
             <w:shd w:fill="F2F2F2" w:color="auto" w:val="clear"/>
             <w:tcMar>
               <w:top w:type="dxa" w:w="90"/>
@@ -3702,69 +4103,13 @@
                 <w:sz w:val="20"/>
                 <w:szCs w:val="20"/>
               </w:rPr>
-              <w:t xml:space="preserve">Qualitativa</w:t>
-            </w:r>
-          </w:p>
-        </w:tc>
-      </w:tr>
-      <w:tr>
-        <w:trPr>
-          <w:tblHeader w:val="false"/>
-        </w:trPr>
-        <w:tc>
-          <w:tcPr>
-            <w:tcW w:type="dxa" w:w="2700"/>
-            <w:tcMar>
-              <w:top w:type="dxa" w:w="90"/>
-              <w:left w:type="dxa" w:w="120"/>
-              <w:bottom w:type="dxa" w:w="90"/>
-              <w:right w:type="dxa" w:w="120"/>
-            </w:tcMar>
-          </w:tcPr>
-          <w:p>
-            <w:pPr>
-              <w:spacing w:after="0" w:line="252"/>
-            </w:pPr>
-            <w:r>
-              <w:rPr>
-                <w:sz w:val="20"/>
-                <w:szCs w:val="20"/>
-              </w:rPr>
-              <w:t xml:space="preserve">Natureza</w:t>
-            </w:r>
-          </w:p>
-        </w:tc>
-        <w:tc>
-          <w:tcPr>
-            <w:tcW w:type="dxa" w:w="6900"/>
-            <w:tcMar>
-              <w:top w:type="dxa" w:w="90"/>
-              <w:left w:type="dxa" w:w="120"/>
-              <w:bottom w:type="dxa" w:w="90"/>
-              <w:right w:type="dxa" w:w="120"/>
-            </w:tcMar>
-          </w:tcPr>
-          <w:p>
-            <w:pPr>
-              <w:spacing w:after="0" w:line="252"/>
-            </w:pPr>
-            <w:r>
-              <w:rPr>
-                <w:sz w:val="20"/>
-                <w:szCs w:val="20"/>
-              </w:rPr>
-              <w:t xml:space="preserve">Pesquisa aplicada</w:t>
-            </w:r>
-          </w:p>
-        </w:tc>
-      </w:tr>
-      <w:tr>
-        <w:trPr>
-          <w:tblHeader w:val="false"/>
-        </w:trPr>
-        <w:tc>
-          <w:tcPr>
-            <w:tcW w:type="dxa" w:w="2700"/>
+              <w:t xml:space="preserve">34%</w:t>
+            </w:r>
+          </w:p>
+        </w:tc>
+        <w:tc>
+          <w:tcPr>
+            <w:tcW w:type="dxa" w:w="2200"/>
             <w:shd w:fill="F2F2F2" w:color="auto" w:val="clear"/>
             <w:tcMar>
               <w:top w:type="dxa" w:w="90"/>
@@ -3782,13 +4127,13 @@
                 <w:sz w:val="20"/>
                 <w:szCs w:val="20"/>
               </w:rPr>
-              <w:t xml:space="preserve">Estratégia</w:t>
-            </w:r>
-          </w:p>
-        </w:tc>
-        <w:tc>
-          <w:tcPr>
-            <w:tcW w:type="dxa" w:w="6900"/>
+              <w:t xml:space="preserve">63,0%</w:t>
+            </w:r>
+          </w:p>
+        </w:tc>
+        <w:tc>
+          <w:tcPr>
+            <w:tcW w:type="dxa" w:w="2200"/>
             <w:shd w:fill="F2F2F2" w:color="auto" w:val="clear"/>
             <w:tcMar>
               <w:top w:type="dxa" w:w="90"/>
@@ -3806,111 +4151,7 @@
                 <w:sz w:val="20"/>
                 <w:szCs w:val="20"/>
               </w:rPr>
-              <w:t xml:space="preserve">Estudo de caso longitudinal</w:t>
-            </w:r>
-          </w:p>
-        </w:tc>
-      </w:tr>
-      <w:tr>
-        <w:trPr>
-          <w:tblHeader w:val="false"/>
-        </w:trPr>
-        <w:tc>
-          <w:tcPr>
-            <w:tcW w:type="dxa" w:w="2700"/>
-            <w:tcMar>
-              <w:top w:type="dxa" w:w="90"/>
-              <w:left w:type="dxa" w:w="120"/>
-              <w:bottom w:type="dxa" w:w="90"/>
-              <w:right w:type="dxa" w:w="120"/>
-            </w:tcMar>
-          </w:tcPr>
-          <w:p>
-            <w:pPr>
-              <w:spacing w:after="0" w:line="252"/>
-            </w:pPr>
-            <w:r>
-              <w:rPr>
-                <w:sz w:val="20"/>
-                <w:szCs w:val="20"/>
-              </w:rPr>
-              <w:t xml:space="preserve">Período</w:t>
-            </w:r>
-          </w:p>
-        </w:tc>
-        <w:tc>
-          <w:tcPr>
-            <w:tcW w:type="dxa" w:w="6900"/>
-            <w:tcMar>
-              <w:top w:type="dxa" w:w="90"/>
-              <w:left w:type="dxa" w:w="120"/>
-              <w:bottom w:type="dxa" w:w="90"/>
-              <w:right w:type="dxa" w:w="120"/>
-            </w:tcMar>
-          </w:tcPr>
-          <w:p>
-            <w:pPr>
-              <w:spacing w:after="0" w:line="252"/>
-            </w:pPr>
-            <w:r>
-              <w:rPr>
-                <w:sz w:val="20"/>
-                <w:szCs w:val="20"/>
-              </w:rPr>
-              <w:t xml:space="preserve">2018 a 2024 (sete anos)</w:t>
-            </w:r>
-          </w:p>
-        </w:tc>
-      </w:tr>
-      <w:tr>
-        <w:trPr>
-          <w:tblHeader w:val="false"/>
-        </w:trPr>
-        <w:tc>
-          <w:tcPr>
-            <w:tcW w:type="dxa" w:w="2700"/>
-            <w:shd w:fill="F2F2F2" w:color="auto" w:val="clear"/>
-            <w:tcMar>
-              <w:top w:type="dxa" w:w="90"/>
-              <w:left w:type="dxa" w:w="120"/>
-              <w:bottom w:type="dxa" w:w="90"/>
-              <w:right w:type="dxa" w:w="120"/>
-            </w:tcMar>
-          </w:tcPr>
-          <w:p>
-            <w:pPr>
-              <w:spacing w:after="0" w:line="252"/>
-            </w:pPr>
-            <w:r>
-              <w:rPr>
-                <w:sz w:val="20"/>
-                <w:szCs w:val="20"/>
-              </w:rPr>
-              <w:t xml:space="preserve">Objeto</w:t>
-            </w:r>
-          </w:p>
-        </w:tc>
-        <w:tc>
-          <w:tcPr>
-            <w:tcW w:type="dxa" w:w="6900"/>
-            <w:shd w:fill="F2F2F2" w:color="auto" w:val="clear"/>
-            <w:tcMar>
-              <w:top w:type="dxa" w:w="90"/>
-              <w:left w:type="dxa" w:w="120"/>
-              <w:bottom w:type="dxa" w:w="90"/>
-              <w:right w:type="dxa" w:w="120"/>
-            </w:tcMar>
-          </w:tcPr>
-          <w:p>
-            <w:pPr>
-              <w:spacing w:after="0" w:line="252"/>
-            </w:pPr>
-            <w:r>
-              <w:rPr>
-                <w:sz w:val="20"/>
-                <w:szCs w:val="20"/>
-              </w:rPr>
-              <w:t xml:space="preserve">Uma IFE da região Norte do país</w:t>
+              <w:t xml:space="preserve">88,5%</w:t>
             </w:r>
           </w:p>
         </w:tc>
@@ -3926,47 +4167,55 @@
         <w:spacing w:after="140" w:line="276"/>
       </w:pPr>
       <w:r>
-        <w:t xml:space="preserve">A escolha do </w:t>
-      </w:r>
-      <w:r>
-        <w:rPr>
-          <w:b/>
-          <w:bCs/>
-        </w:rPr>
-        <w:t xml:space="preserve">DSR</w:t>
-      </w:r>
-      <w:r>
-        <w:t xml:space="preserve"> é coerente com o problema: trata-se de um método voltado à </w:t>
-      </w:r>
-      <w:r>
-        <w:rPr>
-          <w:b/>
-          <w:bCs/>
-        </w:rPr>
-        <w:t xml:space="preserve">construção e avaliação de um artefato</w:t>
-      </w:r>
-      <w:r>
-        <w:t xml:space="preserve"> (aqui, o modelo de governança digital) que resolve um problema prático identificado, e não apenas à descrição de uma realidade. O caráter </w:t>
-      </w:r>
-      <w:r>
-        <w:rPr>
-          <w:b/>
-          <w:bCs/>
-        </w:rPr>
-        <w:t xml:space="preserve">longitudinal</w:t>
-      </w:r>
-      <w:r>
-        <w:t xml:space="preserve"> é o diferencial metodológico do trabalho — em vez de uma fotografia da maturidade em um momento único, o estudo acompanha a </w:t>
-      </w:r>
-      <w:r>
-        <w:rPr>
-          <w:b/>
-          <w:bCs/>
-        </w:rPr>
-        <w:t xml:space="preserve">evolução</w:t>
-      </w:r>
-      <w:r>
-        <w:t xml:space="preserve"> da instituição ao longo de sete anos, o que permite observar se os ganhos de governança se sustentam e se institucionalizam de fato.</w:t>
+        <w:t xml:space="preserve">A instituição passou do nível </w:t>
+      </w:r>
+      <w:r>
+        <w:rPr>
+          <w:b/>
+          <w:bCs/>
+        </w:rPr>
+        <w:t xml:space="preserve">“incipiente” para “aprimorado”</w:t>
+      </w:r>
+      <w:r>
+        <w:t xml:space="preserve">. Um dado adicional reforça o resultado: a execução do plano diretor saltou de </w:t>
+      </w:r>
+      <w:r>
+        <w:rPr>
+          <w:b/>
+          <w:bCs/>
+        </w:rPr>
+        <w:t xml:space="preserve">49,37% (PDTI 2015–2019) para 94,38% (PDTIC 2020–2024)</w:t>
+      </w:r>
+      <w:r>
+        <w:t xml:space="preserve"> — a governança não ficou no papel.</w:t>
+      </w:r>
+    </w:p>
+    <w:p>
+      <w:pPr>
+        <w:spacing w:after="140" w:line="276"/>
+      </w:pPr>
+      <w:r>
+        <w:t xml:space="preserve">Os autores, porém, </w:t>
+      </w:r>
+      <w:r>
+        <w:rPr>
+          <w:b/>
+          <w:bCs/>
+        </w:rPr>
+        <w:t xml:space="preserve">não escondem o que não funcionou</w:t>
+      </w:r>
+      <w:r>
+        <w:t xml:space="preserve">: persistem a alta rotatividade de servidores, a escassez de profissionais capacitados, as restrições orçamentárias e a </w:t>
+      </w:r>
+      <w:r>
+        <w:rPr>
+          <w:b/>
+          <w:bCs/>
+        </w:rPr>
+        <w:t xml:space="preserve">baixa integração entre os setores administrativos e acadêmicos</w:t>
+      </w:r>
+      <w:r>
+        <w:t xml:space="preserve">.</w:t>
       </w:r>
     </w:p>
     <w:p>
@@ -3982,215 +4231,139 @@
           <w:sz w:val="26"/>
           <w:szCs w:val="26"/>
         </w:rPr>
-        <w:t xml:space="preserve">5. Resultados</w:t>
-      </w:r>
-    </w:p>
-    <w:p>
-      <w:pPr>
-        <w:spacing w:after="140" w:line="276"/>
-      </w:pPr>
-      <w:r>
-        <w:t xml:space="preserve">Os resultados evidenciaram </w:t>
-      </w:r>
-      <w:r>
-        <w:rPr>
-          <w:b/>
-          <w:bCs/>
-        </w:rPr>
-        <w:t xml:space="preserve">evolução significativa da maturidade em TI / governança digital</w:t>
-      </w:r>
-      <w:r>
-        <w:t xml:space="preserve"> na instituição analisada. Os principais avanços relatados foram:</w:t>
-      </w:r>
-    </w:p>
-    <w:p>
-      <w:pPr>
-        <w:pStyle w:val="ListParagraph"/>
-        <w:numPr>
-          <w:ilvl w:val="0"/>
-          <w:numId w:val="3"/>
-        </w:numPr>
-        <w:spacing w:after="90" w:line="276"/>
-      </w:pPr>
-      <w:r>
-        <w:rPr>
-          <w:b/>
-          <w:bCs/>
-        </w:rPr>
-        <w:t xml:space="preserve">Formalização de um modelo de governança de TI</w:t>
-      </w:r>
-      <w:r>
-        <w:t xml:space="preserve"> e da estrutura organizacional da área — ou seja, a definição explícita de como a TI é governada na instituição, em vez de arranjos informais.</w:t>
-      </w:r>
-    </w:p>
-    <w:p>
-      <w:pPr>
-        <w:pStyle w:val="ListParagraph"/>
-        <w:numPr>
-          <w:ilvl w:val="0"/>
-          <w:numId w:val="3"/>
-        </w:numPr>
-        <w:spacing w:after="90" w:line="276"/>
-      </w:pPr>
-      <w:r>
-        <w:rPr>
-          <w:b/>
-          <w:bCs/>
-        </w:rPr>
-        <w:t xml:space="preserve">Criação do Comitê Gestor de TI</w:t>
-      </w:r>
-      <w:r>
-        <w:t xml:space="preserve">, estabelecendo uma estrutura formal de tomada de decisão com participação institucional.</w:t>
-      </w:r>
-    </w:p>
-    <w:p>
-      <w:pPr>
-        <w:pStyle w:val="ListParagraph"/>
-        <w:numPr>
-          <w:ilvl w:val="0"/>
-          <w:numId w:val="3"/>
-        </w:numPr>
-        <w:spacing w:after="90" w:line="276"/>
-      </w:pPr>
-      <w:r>
-        <w:rPr>
-          <w:b/>
-          <w:bCs/>
-        </w:rPr>
-        <w:t xml:space="preserve">Institucionalização de políticas, normas, planos, processos e práticas</w:t>
-      </w:r>
-      <w:r>
-        <w:t xml:space="preserve"> — a governança deixa de depender das pessoas que ocupam os cargos e passa a estar registrada em instrumentos normativos.</w:t>
-      </w:r>
-    </w:p>
-    <w:p>
-      <w:pPr>
-        <w:pStyle w:val="ListParagraph"/>
-        <w:numPr>
-          <w:ilvl w:val="0"/>
-          <w:numId w:val="3"/>
-        </w:numPr>
-        <w:spacing w:after="90" w:line="276"/>
-      </w:pPr>
-      <w:r>
-        <w:rPr>
-          <w:b/>
-          <w:bCs/>
-        </w:rPr>
-        <w:t xml:space="preserve">Fortalecimento da segurança da informação</w:t>
-      </w:r>
-      <w:r>
-        <w:t xml:space="preserve">, tema central tanto na EFGD quanto nas exigências de conformidade (LGPD, requisitos dos órgãos de controle).</w:t>
-      </w:r>
-    </w:p>
-    <w:p>
-      <w:pPr>
-        <w:pStyle w:val="ListParagraph"/>
-        <w:numPr>
-          <w:ilvl w:val="0"/>
-          <w:numId w:val="3"/>
-        </w:numPr>
-        <w:spacing w:after="90" w:line="276"/>
-      </w:pPr>
-      <w:r>
-        <w:rPr>
-          <w:b/>
-          <w:bCs/>
-        </w:rPr>
-        <w:t xml:space="preserve">Melhoria na execução dos planos institucionais</w:t>
-      </w:r>
-      <w:r>
-        <w:t xml:space="preserve">, indicando que a governança não ficou restrita ao papel: ela se refletiu na capacidade real de a instituição entregar o que planejou.</w:t>
-      </w:r>
-    </w:p>
-    <w:p>
-      <w:pPr>
-        <w:pStyle w:val="Heading2"/>
-        <w:spacing w:after="160" w:before="300"/>
+        <w:t xml:space="preserve">6. Limitações e considerações finais</w:t>
+      </w:r>
+    </w:p>
+    <w:p>
+      <w:pPr>
+        <w:spacing w:after="140" w:line="276"/>
+      </w:pPr>
+      <w:r>
+        <w:t xml:space="preserve">O estudo reconhece limitações relevantes: </w:t>
+      </w:r>
+      <w:r>
+        <w:rPr>
+          <w:b/>
+          <w:bCs/>
+        </w:rPr>
+        <w:t xml:space="preserve">caso único</w:t>
+      </w:r>
+      <w:r>
+        <w:t xml:space="preserve">, com amostra por conveniência numa instituição que </w:t>
+      </w:r>
+      <w:r>
+        <w:rPr>
+          <w:b/>
+          <w:bCs/>
+        </w:rPr>
+        <w:t xml:space="preserve">já tinha histórico de iniciativas em GD</w:t>
+      </w:r>
+      <w:r>
+        <w:t xml:space="preserve">; risco de </w:t>
+      </w:r>
+      <w:r>
+        <w:rPr>
+          <w:b/>
+          <w:bCs/>
+        </w:rPr>
+        <w:t xml:space="preserve">viés de confirmação</w:t>
+      </w:r>
+      <w:r>
+        <w:t xml:space="preserve"> (participantes interessados em reforçar a eficácia de um modelo que ajudaram a implantar); e ausência de </w:t>
+      </w:r>
+      <w:r>
+        <w:rPr>
+          <w:b/>
+          <w:bCs/>
+        </w:rPr>
+        <w:t xml:space="preserve">auditoria externa</w:t>
+      </w:r>
+      <w:r>
+        <w:t xml:space="preserve"> — logo, os achados não são generalizáveis.</w:t>
+      </w:r>
+    </w:p>
+    <w:p>
+      <w:pPr>
+        <w:spacing w:after="140" w:line="276"/>
+      </w:pPr>
+      <w:r>
+        <w:t xml:space="preserve">As contribuições declaradas são três: </w:t>
+      </w:r>
+      <w:r>
+        <w:rPr>
+          <w:b/>
+          <w:bCs/>
+        </w:rPr>
+        <w:t xml:space="preserve">integração estratégica e operacional</w:t>
+      </w:r>
+      <w:r>
+        <w:t xml:space="preserve">, </w:t>
+      </w:r>
+      <w:r>
+        <w:rPr>
+          <w:b/>
+          <w:bCs/>
+        </w:rPr>
+        <w:t xml:space="preserve">metodologia empiricamente validada</w:t>
+      </w:r>
+      <w:r>
+        <w:t xml:space="preserve"> e </w:t>
+      </w:r>
+      <w:r>
+        <w:rPr>
+          <w:b/>
+          <w:bCs/>
+        </w:rPr>
+        <w:t xml:space="preserve">modelo replicável</w:t>
+      </w:r>
+      <w:r>
+        <w:t xml:space="preserve">. A conclusão central: a maturidade em GD </w:t>
+      </w:r>
+      <w:r>
+        <w:rPr>
+          <w:b/>
+          <w:bCs/>
+        </w:rPr>
+        <w:t xml:space="preserve">não evolui de forma linear</w:t>
+      </w:r>
+      <w:r>
+        <w:t xml:space="preserve"> — depende de apoio da alta gestão, da cultura organizacional e das políticas públicas.</w:t>
+      </w:r>
+    </w:p>
+    <w:p>
+      <w:pPr>
+        <w:pStyle w:val="Heading1"/>
+        <w:pageBreakBefore/>
+        <w:spacing w:after="200" w:before="0"/>
       </w:pPr>
       <w:r>
         <w:rPr>
           <w:b/>
           <w:bCs/>
           <w:color w:val="1F3864"/>
-          <w:sz w:val="26"/>
-          <w:szCs w:val="26"/>
-        </w:rPr>
-        <w:t xml:space="preserve">6. Conclusão</w:t>
-      </w:r>
-    </w:p>
-    <w:p>
-      <w:pPr>
-        <w:spacing w:after="140" w:line="276"/>
-      </w:pPr>
-      <w:r>
-        <w:t xml:space="preserve">A solução proposta se mostrou </w:t>
-      </w:r>
-      <w:r>
-        <w:rPr>
-          <w:b/>
-          <w:bCs/>
-        </w:rPr>
-        <w:t xml:space="preserve">viável e eficaz</w:t>
-      </w:r>
-      <w:r>
-        <w:t xml:space="preserve">, com </w:t>
-      </w:r>
-      <w:r>
-        <w:rPr>
-          <w:b/>
-          <w:bCs/>
-        </w:rPr>
-        <w:t xml:space="preserve">potencial de replicação em outras IFEs</w:t>
-      </w:r>
-      <w:r>
-        <w:t xml:space="preserve">, contribuindo para uma </w:t>
-      </w:r>
-      <w:r>
-        <w:rPr>
-          <w:b/>
-          <w:bCs/>
-        </w:rPr>
-        <w:t xml:space="preserve">transformação digital sustentável da educação pública federal</w:t>
-      </w:r>
-      <w:r>
-        <w:t xml:space="preserve">. A palavra “sustentável” é relevante aqui: o que o estudo longitudinal sugere é que os ganhos não foram um pico pontual de conformidade, mas uma mudança que se manteve ao longo dos anos porque foi institucionalizada.</w:t>
-      </w:r>
-    </w:p>
-    <w:p>
-      <w:pPr>
-        <w:pStyle w:val="Heading2"/>
-        <w:spacing w:after="160" w:before="300"/>
-      </w:pPr>
-      <w:r>
-        <w:rPr>
-          <w:b/>
-          <w:bCs/>
-          <w:color w:val="1F3864"/>
-          <w:sz w:val="26"/>
-          <w:szCs w:val="26"/>
-        </w:rPr>
-        <w:t xml:space="preserve">7. Análise crítica e diálogo com Weill &amp; Ross</w:t>
-      </w:r>
-    </w:p>
-    <w:p>
-      <w:pPr>
-        <w:spacing w:after="140" w:line="276"/>
+          <w:sz w:val="32"/>
+          <w:szCs w:val="32"/>
+        </w:rPr>
+        <w:t xml:space="preserve">Apêndice (opcional) — Diálogo entre os dois artigos</w:t>
+      </w:r>
+    </w:p>
+    <w:p>
+      <w:pPr>
+        <w:pBdr>
+          <w:left w:val="single" w:color="BFBFBF" w:sz="12" w:space="10"/>
+        </w:pBdr>
+        <w:spacing w:after="140" w:line="264"/>
+        <w:ind w:left="340"/>
       </w:pPr>
       <w:r>
         <w:rPr>
           <w:i/>
           <w:iCs/>
-        </w:rPr>
-        <w:t xml:space="preserve">(Esta seção é leitura própria, não do artigo.)</w:t>
-      </w:r>
-    </w:p>
-    <w:p>
-      <w:pPr>
-        <w:spacing w:after="140" w:line="276"/>
-      </w:pPr>
-      <w:r>
-        <w:t xml:space="preserve">A aproximação com o artigo da Questão 1 é direta e vale registrar:</w:t>
+          <w:color w:val="595959"/>
+          <w:sz w:val="20"/>
+          <w:szCs w:val="20"/>
+        </w:rPr>
+        <w:t xml:space="preserve">Seção de leitura própria, fora do limite de 2 páginas da síntese. Pode ser removida antes da entrega.</w:t>
       </w:r>
     </w:p>
     <w:p>
@@ -4210,7 +4383,7 @@
         <w:t xml:space="preserve">“Governança eficaz não acontece por acidente.”</w:t>
       </w:r>
       <w:r>
-        <w:t xml:space="preserve"> O artigo brasileiro é praticamente um estudo de caso dessa tese no setor público: a maturidade só evoluiu quando a governança foi </w:t>
+        <w:t xml:space="preserve"> O artigo de Cardoso, Moreira e Parente é um estudo de caso dessa tese no setor público: a maturidade só evoluiu quando a governança foi </w:t>
       </w:r>
       <w:r>
         <w:rPr>
@@ -4220,7 +4393,7 @@
         <w:t xml:space="preserve">desenhada e formalizada</w:t>
       </w:r>
       <w:r>
-        <w:t xml:space="preserve">, e não quando surgiram iniciativas isoladas de TI.</w:t>
+        <w:t xml:space="preserve">.</w:t>
       </w:r>
     </w:p>
     <w:p>
@@ -4237,30 +4410,30 @@
           <w:b/>
           <w:bCs/>
         </w:rPr>
-        <w:t xml:space="preserve">O comitê não veio sozinho.</w:t>
-      </w:r>
-      <w:r>
-        <w:t xml:space="preserve"> Assim como Weill &amp; Ross alertam que criar um comitê não basta, os resultados relatados combinam </w:t>
-      </w:r>
-      <w:r>
-        <w:rPr>
-          <w:b/>
-          <w:bCs/>
-        </w:rPr>
-        <w:t xml:space="preserve">estrutura de decisão</w:t>
-      </w:r>
-      <w:r>
-        <w:t xml:space="preserve"> (o Comitê Gestor de TI) com </w:t>
-      </w:r>
-      <w:r>
-        <w:rPr>
-          <w:b/>
-          <w:bCs/>
-        </w:rPr>
-        <w:t xml:space="preserve">institucionalização de políticas, normas, planos, processos e práticas</w:t>
-      </w:r>
-      <w:r>
-        <w:t xml:space="preserve"> — o que corresponde aos processos de alinhamento e à formalização de que os autores do MIT falam.</w:t>
+        <w:t xml:space="preserve">O comitê não veio sozinho — e isso é o ponto.</w:t>
+      </w:r>
+      <w:r>
+        <w:t xml:space="preserve"> O CGTI foi criado em 2019, mas os índices só deslancharam depois de 2021, quando vieram políticas, normas, processos, catálogo de serviços e capacitação. É exatamente o alerta do item (f) da Questão 1: comitê é uma estrutura de decisão, e governança exige também </w:t>
+      </w:r>
+      <w:r>
+        <w:rPr>
+          <w:b/>
+          <w:bCs/>
+        </w:rPr>
+        <w:t xml:space="preserve">processos de alinhamento</w:t>
+      </w:r>
+      <w:r>
+        <w:t xml:space="preserve"> e </w:t>
+      </w:r>
+      <w:r>
+        <w:rPr>
+          <w:b/>
+          <w:bCs/>
+        </w:rPr>
+        <w:t xml:space="preserve">comunicação formal</w:t>
+      </w:r>
+      <w:r>
+        <w:t xml:space="preserve">.</w:t>
       </w:r>
     </w:p>
     <w:p>
@@ -4277,10 +4450,10 @@
           <w:b/>
           <w:bCs/>
         </w:rPr>
-        <w:t xml:space="preserve">Sinergia versus autonomia em versão multicampi.</w:t>
-      </w:r>
-      <w:r>
-        <w:t xml:space="preserve"> O trade-off central de Weill &amp; Ross reaparece aqui sob outro nome: uma IFE multicampi precisa decidir o que padroniza centralmente e o que deixa a cargo de cada campus. É exatamente o tipo de decisão que a matriz “governança em uma página” ajudaria a explicitar.</w:t>
+        <w:t xml:space="preserve">Os domínios coincidem.</w:t>
+      </w:r>
+      <w:r>
+        <w:t xml:space="preserve"> “Avaliar, dirigir e monitorar” versus os quatro subdomínios de gestão reproduz a distinção governança × gestão do item (b).</w:t>
       </w:r>
     </w:p>
     <w:p>
@@ -4297,70 +4470,10 @@
           <w:b/>
           <w:bCs/>
         </w:rPr>
-        <w:t xml:space="preserve">Uma diferença importante de contexto:</w:t>
-      </w:r>
-      <w:r>
-        <w:t xml:space="preserve"> em Weill &amp; Ross o direcionador é o desempenho financeiro (lucro, utilização de ativos, crescimento). Numa IFE, o direcionador é o </w:t>
-      </w:r>
-      <w:r>
-        <w:rPr>
-          <w:b/>
-          <w:bCs/>
-        </w:rPr>
-        <w:t xml:space="preserve">cumprimento da missão institucional e a conformidade com as diretrizes federais (EFGD)</w:t>
-      </w:r>
-      <w:r>
-        <w:t xml:space="preserve"> — o que muda as métricas, mas não muda a lógica de que a governança deve ser desenhada para induzir os comportamentos que aquele objetivo exige.</w:t>
-      </w:r>
-    </w:p>
-    <w:p>
-      <w:r>
-        <w:br w:type="page"/>
-      </w:r>
-    </w:p>
-    <w:p>
-      <w:pPr>
-        <w:spacing w:after="180" w:before="100"/>
-      </w:pPr>
-      <w:r>
-        <w:rPr>
-          <w:b/>
-          <w:bCs/>
-          <w:color w:val="C00000"/>
-          <w:sz w:val="24"/>
-          <w:szCs w:val="24"/>
-        </w:rPr>
-        <w:t xml:space="preserve">NOTA DE STATUS — APAGUE ESTA PÁGINA ANTES DE ENTREGAR</w:t>
-      </w:r>
-    </w:p>
-    <w:p>
-      <w:pPr>
-        <w:spacing w:after="140" w:line="276"/>
-      </w:pPr>
-      <w:r>
-        <w:rPr>
-          <w:b/>
-          <w:bCs/>
-        </w:rPr>
-        <w:t xml:space="preserve">O que está feito:</w:t>
-      </w:r>
-      <w:r>
-        <w:t xml:space="preserve"> a síntese da Questão 2 é fiel ao resumo oficial publicado pela revista (problema, justificativa, objetivo, metodologia, resultados e conclusão) e aos metadados confirmados da publicação (Rev. Sítio Novo, Palmas, v. 9, e1795, 2025, 20 páginas, e-ISSN 2594-7036).</w:t>
-      </w:r>
-    </w:p>
-    <w:p>
-      <w:pPr>
-        <w:spacing w:after="140" w:line="276"/>
-      </w:pPr>
-      <w:r>
-        <w:rPr>
-          <w:b/>
-          <w:bCs/>
-        </w:rPr>
-        <w:t xml:space="preserve">O que falta:</w:t>
-      </w:r>
-      <w:r>
-        <w:t xml:space="preserve"> não foi possível acessar o texto completo do artigo. Tanto o site da revista (sitionovo.ifto.edu.br) quanto o ResearchGate estão bloqueados pela política de rede da sessão em que este documento foi gerado. Por isso, os pontos abaixo precisam ser completados a partir do PDF do Moodle:</w:t>
+        <w:t xml:space="preserve">Sinergia versus autonomia, em versão multicampi.</w:t>
+      </w:r>
+      <w:r>
+        <w:t xml:space="preserve"> A “baixa integração entre setores” que o artigo aponta como limitação é o trade-off de Weill &amp; Ross aparecendo como problema prático.</w:t>
       </w:r>
     </w:p>
     <w:p>
@@ -4377,110 +4490,20 @@
           <w:b/>
           <w:bCs/>
         </w:rPr>
-        <w:t xml:space="preserve">Autoria e filiação</w:t>
-      </w:r>
-      <w:r>
-        <w:t xml:space="preserve"> — os nomes dos autores não constam nos metadados confirmados. Complete a referência em ABNT: SOBRENOME, Nome et al. Governança digital: uma estratégia para o sucesso da transformação digital na educação pública federal. Rev. Sítio Novo, Palmas, v. 9, e1795, 2025.</w:t>
-      </w:r>
-    </w:p>
-    <w:p>
-      <w:pPr>
-        <w:pStyle w:val="ListParagraph"/>
-        <w:numPr>
-          <w:ilvl w:val="0"/>
-          <w:numId w:val="2"/>
-        </w:numPr>
-        <w:spacing w:after="90" w:line="276"/>
-      </w:pPr>
-      <w:r>
-        <w:rPr>
-          <w:b/>
-          <w:bCs/>
-        </w:rPr>
-        <w:t xml:space="preserve">Detalhamento do artefato</w:t>
-      </w:r>
-      <w:r>
-        <w:t xml:space="preserve"> — quais são os componentes concretos do modelo de governança digital proposto (instrumentos, papéis, fluxos, documentos).</w:t>
-      </w:r>
-    </w:p>
-    <w:p>
-      <w:pPr>
-        <w:pStyle w:val="ListParagraph"/>
-        <w:numPr>
-          <w:ilvl w:val="0"/>
-          <w:numId w:val="2"/>
-        </w:numPr>
-        <w:spacing w:after="90" w:line="276"/>
-      </w:pPr>
-      <w:r>
-        <w:rPr>
-          <w:b/>
-          <w:bCs/>
-        </w:rPr>
-        <w:t xml:space="preserve">Ciclos do DSR</w:t>
-      </w:r>
-      <w:r>
-        <w:t xml:space="preserve"> — como foram conduzidas as iterações de construção e avaliação ao longo de 2018–2024.</w:t>
-      </w:r>
-    </w:p>
-    <w:p>
-      <w:pPr>
-        <w:pStyle w:val="ListParagraph"/>
-        <w:numPr>
-          <w:ilvl w:val="0"/>
-          <w:numId w:val="2"/>
-        </w:numPr>
-        <w:spacing w:after="90" w:line="276"/>
-      </w:pPr>
-      <w:r>
-        <w:rPr>
-          <w:b/>
-          <w:bCs/>
-        </w:rPr>
-        <w:t xml:space="preserve">Indicadores de maturidade</w:t>
-      </w:r>
-      <w:r>
-        <w:t xml:space="preserve"> — qual modelo/escala de maturidade foi usado e quais foram os números de antes e depois.</w:t>
-      </w:r>
-    </w:p>
-    <w:p>
-      <w:pPr>
-        <w:pStyle w:val="ListParagraph"/>
-        <w:numPr>
-          <w:ilvl w:val="0"/>
-          <w:numId w:val="2"/>
-        </w:numPr>
-        <w:spacing w:after="90" w:line="276"/>
-      </w:pPr>
-      <w:r>
-        <w:rPr>
-          <w:b/>
-          <w:bCs/>
-        </w:rPr>
-        <w:t xml:space="preserve">Referencial teórico</w:t>
-      </w:r>
-      <w:r>
-        <w:t xml:space="preserve"> — quais frameworks consolidados foram adaptados (COBIT, referenciais do TCU, IN SGD/ME, etc.) e como.</w:t>
-      </w:r>
-    </w:p>
-    <w:p>
-      <w:pPr>
-        <w:pStyle w:val="ListParagraph"/>
-        <w:numPr>
-          <w:ilvl w:val="0"/>
-          <w:numId w:val="2"/>
-        </w:numPr>
-        <w:spacing w:after="90" w:line="276"/>
-      </w:pPr>
-      <w:r>
-        <w:rPr>
-          <w:b/>
-          <w:bCs/>
-        </w:rPr>
-        <w:t xml:space="preserve">Limitações</w:t>
-      </w:r>
-      <w:r>
-        <w:t xml:space="preserve"> apontadas pelos autores e sugestões de trabalhos futuros.</w:t>
+        <w:t xml:space="preserve">O que muda é o direcionador.</w:t>
+      </w:r>
+      <w:r>
+        <w:t xml:space="preserve"> Em Weill &amp; Ross ele é financeiro (lucro, ativos, crescimento); na IFE é a </w:t>
+      </w:r>
+      <w:r>
+        <w:rPr>
+          <w:b/>
+          <w:bCs/>
+        </w:rPr>
+        <w:t xml:space="preserve">missão institucional e a conformidade com a EFGD</w:t>
+      </w:r>
+      <w:r>
+        <w:t xml:space="preserve">. Mudam as métricas — iGovTI e iGestTI no lugar de ROE e ROA —, mas não muda a lógica de desenhar a governança para induzir os comportamentos que o objetivo exige.</w:t>
       </w:r>
     </w:p>
     <w:sectPr>

</xml_diff>